<commit_message>
Fix Agent resource routing and refine desktop workspace
Require validated workspace resource IDs for draft writes and locate results by actual artifact IDs.
Expose pending scene/shot proposals, correct parent relationships, and bind reusable production scenes with schema v42.
Add full-image previews and an inline viewer, keep conversation windows open at their minimum width, and apply the approved light palette.
Synchronize implementation notes and record branch scope, validation, and remaining acceptance boundaries in docs/branches/codex-llm-intent-execution.md.

Validation: 1010 tests, typecheck, build, lint, format:check, and git diff --check passed.
</commit_message>
<xml_diff>
--- a/docs/素材库优化方案.docx
+++ b/docs/素材库优化方案.docx
@@ -2018,6 +2018,14 @@
       </w:pPr>
       <w:r>
         <w:t>回收站通过页面工具栏入口切换删除状态，但仍使用同一页面结构和筛选控件，不建立素材库内部侧边栏。图片在卡片和详情中完整显示、不裁切主体；视频在卡片和详情中提供页内播放控制。</w:t>
+      </w:r>
+    </w:p>
+    <w:p>
+      <w:pPr>
+        <w:pStyle w:val="ListBullet"/>
+      </w:pPr>
+      <w:r>
+        <w:t>生成图片直接显示预览；角色/场景图片、镜头图片及参考图、生成结果和素材详情中的预览均完整显示画面。点击图片在当前页面放大查看，可通过关闭按钮、点击遮罩或 Esc 返回；一次生成多张图片时逐张预览。</w:t>
       </w:r>
     </w:p>
     <w:p>

</xml_diff>

<commit_message>
feat: refine workspace asset library and novel entry
</commit_message>
<xml_diff>
--- a/docs/素材库优化方案.docx
+++ b/docs/素材库优化方案.docx
@@ -110,7 +110,9 @@
             <w:pPr>
               <w:spacing w:after="0"/>
             </w:pPr>
-            <w:r/>
+            <w:r>
+              <w:t>v1.1</w:t>
+            </w:r>
             <w:r>
               <w:rPr>
                 <w:rFonts w:ascii="Calibri" w:hAnsi="Calibri" w:eastAsia="Microsoft YaHei"/>
@@ -118,7 +120,6 @@
                 <w:color w:val="0B2545"/>
                 <w:sz w:val="19"/>
               </w:rPr>
-              <w:t>v1.0</w:t>
             </w:r>
           </w:p>
         </w:tc>
@@ -335,7 +336,7 @@
                 <w:color w:val="0B2545"/>
                 <w:sz w:val="21"/>
               </w:rPr>
-              <w:t xml:space="preserve">方案结论  </w:t>
+              <w:t>方案结论 素材库只管理成功生成且可复用的图片和视频；以别名、项目共享标签和手动素材组完成查找与复用，并通过拖拽把素材快照送入具体生产环境。任务过程与失败记录继续由任务日志负责。</w:t>
             </w:r>
             <w:r>
               <w:rPr>
@@ -343,7 +344,6 @@
                 <w:color w:val="0B2545"/>
                 <w:sz w:val="21"/>
               </w:rPr>
-              <w:t>素材库只管理成功生成且可复用的图片和视频；以别名、项目共享标签和动态素材组完成查找与复用，并通过拖拽把素材快照送入具体生产环境。任务过程与失败记录继续由任务日志负责。</w:t>
             </w:r>
           </w:p>
         </w:tc>
@@ -822,7 +822,7 @@
                 <w:color w:val="252A31"/>
                 <w:sz w:val="18"/>
               </w:rPr>
-              <w:t>标签项目共享、素材组动态更新、删除进入回收站</w:t>
+              <w:t>标签项目共享、素材组手动维护、删除进入回收站</w:t>
             </w:r>
           </w:p>
         </w:tc>
@@ -892,7 +892,7 @@
         <w:rPr>
           <w:rFonts w:ascii="Calibri" w:hAnsi="Calibri" w:eastAsia="Microsoft YaHei"/>
         </w:rPr>
-        <w:t>轻量组织优先：标签只描述素材；素材组保存标签组合条件，不建立复杂目录树。</w:t>
+        <w:t>轻量组织优先：标签只描述素材；素材组保存用户明确加入的素材集合，不建立复杂目录树。</w:t>
       </w:r>
     </w:p>
     <w:p>
@@ -916,7 +916,7 @@
         <w:rPr>
           <w:rFonts w:ascii="Calibri" w:hAnsi="Calibri" w:eastAsia="Microsoft YaHei"/>
         </w:rPr>
-        <w:t>动态筛选、静态使用：素材组在拖拽前动态更新；拖入后形成当次引用快照，避免生产内容被后续标签变化影响。</w:t>
+        <w:t>手动编组、静态使用：素材组成员由用户拖入或多选加入；拖入生产环境后形成当次引用快照。</w:t>
       </w:r>
     </w:p>
     <w:p>
@@ -1314,7 +1314,7 @@
                 <w:color w:val="252A31"/>
                 <w:sz w:val="18"/>
               </w:rPr>
-              <w:t>素材组由多个标签组成，匹配必须同时包含全部标签的素材。</w:t>
+              <w:t>素材组由用户明确加入的多个素材组成。</w:t>
             </w:r>
           </w:p>
         </w:tc>
@@ -1341,7 +1341,7 @@
                 <w:color w:val="252A31"/>
                 <w:sz w:val="18"/>
               </w:rPr>
-              <w:t>动态规则</w:t>
+              <w:t>集合维护</w:t>
             </w:r>
           </w:p>
         </w:tc>
@@ -1366,7 +1366,7 @@
                 <w:color w:val="252A31"/>
                 <w:sz w:val="18"/>
               </w:rPr>
-              <w:t>素材标签变化后，素材组结果自动加入或移出。</w:t>
+              <w:t>用户可拖入素材或将当前多选素材加入；移除成员不修改素材本身。</w:t>
             </w:r>
           </w:p>
         </w:tc>
@@ -1531,6 +1531,60 @@
           </w:p>
         </w:tc>
       </w:tr>
+      <w:tr>
+        <w:tc>
+          <w:tcPr>
+            <w:tcW w:type="dxa" w:w="2100"/>
+            <w:shd w:fill="FAFBFC"/>
+            <w:tcMar>
+              <w:top w:w="90" w:type="dxa"/>
+              <w:start w:w="120" w:type="dxa"/>
+              <w:bottom w:w="90" w:type="dxa"/>
+              <w:end w:w="120" w:type="dxa"/>
+            </w:tcMar>
+            <w:vAlign w:val="center"/>
+          </w:tcPr>
+          <w:p>
+            <w:pPr>
+              <w:spacing w:after="0" w:line="259" w:lineRule="auto"/>
+            </w:pPr>
+            <w:r>
+              <w:rPr>
+                <w:rFonts w:ascii="Calibri" w:hAnsi="Calibri" w:eastAsia="Microsoft YaHei"/>
+                <w:color w:val="252A31"/>
+                <w:sz w:val="18"/>
+              </w:rPr>
+              <w:t>工作区并行打开</w:t>
+            </w:r>
+          </w:p>
+        </w:tc>
+        <w:tc>
+          <w:tcPr>
+            <w:tcW w:type="dxa" w:w="7260"/>
+            <w:shd w:fill="FAFBFC"/>
+            <w:tcMar>
+              <w:top w:w="90" w:type="dxa"/>
+              <w:start w:w="120" w:type="dxa"/>
+              <w:bottom w:w="90" w:type="dxa"/>
+              <w:end w:w="120" w:type="dxa"/>
+            </w:tcMar>
+            <w:vAlign w:val="center"/>
+          </w:tcPr>
+          <w:p>
+            <w:pPr>
+              <w:spacing w:after="0" w:line="259" w:lineRule="auto"/>
+            </w:pPr>
+            <w:r>
+              <w:rPr>
+                <w:rFonts w:ascii="Calibri" w:hAnsi="Calibri" w:eastAsia="Microsoft YaHei"/>
+                <w:color w:val="252A31"/>
+                <w:sz w:val="18"/>
+              </w:rPr>
+              <w:t>素材库是独立工作区面板，可与其他项目资料同时打开；布局按项目在本地保存。</w:t>
+            </w:r>
+          </w:p>
+        </w:tc>
+      </w:tr>
     </w:tbl>
     <w:p>
       <w:pPr>
@@ -1552,7 +1606,7 @@
     </w:p>
     <w:p>
       <w:r>
-        <w:t>素材库作为独立工作区进入，不与生成任务状态混排。用户点击一级菜单“素材库”后直接进入唯一的素材库页面，默认展示全部未删除素材。页面采用顶部搜索与筛选工具栏、中央素材网格、右侧详情面板的单页面结构；素材库内部不再增加第二层侧边栏或独立导航页。</w:t>
+        <w:t>素材库作为独立工作区面板进入，不与生成任务状态混排。用户点击一级菜单“素材库”后打开或激活唯一的素材库面板，保留当前已打开的其他项目资料页面，默认展示全部未删除素材。页面以高密度浏览和重复操作为主，采用顶部搜索与筛选工具栏、中央素材网格、右侧详情面板的单页面结构；素材库内部不再增加第二层侧边栏或独立导航页。</w:t>
       </w:r>
     </w:p>
     <w:tbl>
@@ -1615,7 +1669,7 @@
           </w:tcPr>
           <w:p>
             <w:r>
-              <w:t>别名/文件名/标签名搜索、图片/视频类型、时间、素材组、排序</w:t>
+              <w:t>主要内容</w:t>
             </w:r>
           </w:p>
         </w:tc>
@@ -1633,7 +1687,7 @@
           </w:tcPr>
           <w:p>
             <w:r>
-              <w:t>清空筛选、管理素材组、多选、批量打标签</w:t>
+              <w:t>核心动作</w:t>
             </w:r>
           </w:p>
         </w:tc>
@@ -1685,7 +1739,7 @@
                 <w:color w:val="252A31"/>
                 <w:sz w:val="18"/>
               </w:rPr>
-              <w:t>别名/文件名/标签名搜索、类型、时间、素材组、排序</w:t>
+              <w:t>别名/文件名/标签名搜索、图片/视频类型、时间、素材组、排序</w:t>
             </w:r>
           </w:p>
         </w:tc>
@@ -1710,7 +1764,7 @@
                 <w:color w:val="252A31"/>
                 <w:sz w:val="18"/>
               </w:rPr>
-              <w:t>清空筛选、多选、批量打标签</w:t>
+              <w:t>清空筛选、管理素材组、多选、批量打标签</w:t>
             </w:r>
           </w:p>
         </w:tc>
@@ -1730,7 +1784,7 @@
           </w:tcPr>
           <w:p>
             <w:r>
-              <w:t>筛选菜单</w:t>
+              <w:t>中央网格</w:t>
             </w:r>
           </w:p>
         </w:tc>
@@ -1748,7 +1802,7 @@
           </w:tcPr>
           <w:p>
             <w:r>
-              <w:t>图片、视频、素材组、回收站状态</w:t>
+              <w:t>固定尺寸缩略图、别名、标签、创建时间</w:t>
             </w:r>
           </w:p>
         </w:tc>
@@ -1766,7 +1820,7 @@
           </w:tcPr>
           <w:p>
             <w:r>
-              <w:t>刷新同一素材网格，不切换独立页面</w:t>
+              <w:t>选择、预览、拖拽、批量操作</w:t>
             </w:r>
           </w:p>
         </w:tc>
@@ -1793,84 +1847,6 @@
                 <w:color w:val="252A31"/>
                 <w:sz w:val="18"/>
               </w:rPr>
-              <w:t>中央网格</w:t>
-            </w:r>
-          </w:p>
-        </w:tc>
-        <w:tc>
-          <w:tcPr>
-            <w:tcW w:type="dxa" w:w="4200"/>
-            <w:tcMar>
-              <w:top w:w="90" w:type="dxa"/>
-              <w:start w:w="120" w:type="dxa"/>
-              <w:bottom w:w="90" w:type="dxa"/>
-              <w:end w:w="120" w:type="dxa"/>
-            </w:tcMar>
-            <w:vAlign w:val="center"/>
-          </w:tcPr>
-          <w:p>
-            <w:pPr>
-              <w:spacing w:after="0" w:line="259" w:lineRule="auto"/>
-            </w:pPr>
-            <w:r>
-              <w:rPr>
-                <w:rFonts w:ascii="Calibri" w:hAnsi="Calibri" w:eastAsia="Microsoft YaHei"/>
-                <w:color w:val="252A31"/>
-                <w:sz w:val="18"/>
-              </w:rPr>
-              <w:t>固定尺寸缩略图、别名、标签、创建时间</w:t>
-            </w:r>
-          </w:p>
-        </w:tc>
-        <w:tc>
-          <w:tcPr>
-            <w:tcW w:type="dxa" w:w="3460"/>
-            <w:tcMar>
-              <w:top w:w="90" w:type="dxa"/>
-              <w:start w:w="120" w:type="dxa"/>
-              <w:bottom w:w="90" w:type="dxa"/>
-              <w:end w:w="120" w:type="dxa"/>
-            </w:tcMar>
-            <w:vAlign w:val="center"/>
-          </w:tcPr>
-          <w:p>
-            <w:pPr>
-              <w:spacing w:after="0" w:line="259" w:lineRule="auto"/>
-            </w:pPr>
-            <w:r>
-              <w:rPr>
-                <w:rFonts w:ascii="Calibri" w:hAnsi="Calibri" w:eastAsia="Microsoft YaHei"/>
-                <w:color w:val="252A31"/>
-                <w:sz w:val="18"/>
-              </w:rPr>
-              <w:t>选择、预览、拖拽、批量操作</w:t>
-            </w:r>
-          </w:p>
-        </w:tc>
-      </w:tr>
-      <w:tr>
-        <w:tc>
-          <w:tcPr>
-            <w:tcW w:type="dxa" w:w="1700"/>
-            <w:shd w:fill="FAFBFC"/>
-            <w:tcMar>
-              <w:top w:w="90" w:type="dxa"/>
-              <w:start w:w="120" w:type="dxa"/>
-              <w:bottom w:w="90" w:type="dxa"/>
-              <w:end w:w="120" w:type="dxa"/>
-            </w:tcMar>
-            <w:vAlign w:val="center"/>
-          </w:tcPr>
-          <w:p>
-            <w:pPr>
-              <w:spacing w:after="0" w:line="259" w:lineRule="auto"/>
-            </w:pPr>
-            <w:r>
-              <w:rPr>
-                <w:rFonts w:ascii="Calibri" w:hAnsi="Calibri" w:eastAsia="Microsoft YaHei"/>
-                <w:color w:val="252A31"/>
-                <w:sz w:val="18"/>
-              </w:rPr>
               <w:t>右侧详情</w:t>
             </w:r>
           </w:p>
@@ -1878,7 +1854,6 @@
         <w:tc>
           <w:tcPr>
             <w:tcW w:type="dxa" w:w="4200"/>
-            <w:shd w:fill="FAFBFC"/>
             <w:tcMar>
               <w:top w:w="90" w:type="dxa"/>
               <w:start w:w="120" w:type="dxa"/>
@@ -1904,7 +1879,6 @@
         <w:tc>
           <w:tcPr>
             <w:tcW w:type="dxa" w:w="3460"/>
-            <w:shd w:fill="FAFBFC"/>
             <w:tcMar>
               <w:top w:w="90" w:type="dxa"/>
               <w:start w:w="120" w:type="dxa"/>
@@ -1969,7 +1943,7 @@
           </w:tcPr>
           <w:p>
             <w:r>
-              <w:t>素材库：搜索（别名 / 文件名 / 标签名） + [全部素材 | 图片 | 视频] + 素材组 + 时间 + 排序</w:t>
+              <w:t>素材库：搜索（别名 / 文件名 / 标签名） + 类型下拉（全部素材 / 图片 / 视频） + 素材组 + 时间 + 排序</w:t>
             </w:r>
           </w:p>
         </w:tc>
@@ -1993,7 +1967,7 @@
         <w:pStyle w:val="ListBullet"/>
       </w:pPr>
       <w:r>
-        <w:t>- 类型使用单选下拉菜单，默认展示“全部素材”；选择“图片”或“视频”时复用相同的搜索、素材组、时间、排序和视图能力，用户仍可继续叠加其他筛选条件。</w:t>
+        <w:t>类型使用单选下拉菜单，默认展示“全部素材”；选择“图片”或“视频”时复用相同的搜索、素材组、时间、排序和视图能力，用户仍可继续叠加其他筛选条件。</w:t>
       </w:r>
     </w:p>
     <w:p>
@@ -2001,7 +1975,7 @@
         <w:pStyle w:val="ListBullet"/>
       </w:pPr>
       <w:r>
-        <w:t>顶部不提供单独的“标签”筛选控件；搜索框同时匹配素材别名、物理文件名和标签名称。标签仍用于素材详情编辑、批量打标签和素材组条件，标签管理通过详情区域的独立入口完成。</w:t>
+        <w:t>顶部不提供单独的“标签”筛选控件；搜索框同时匹配素材别名、物理文件名和标签名称。标签仍用于素材详情编辑和批量打标签，标签管理通过详情区域的独立入口完成。</w:t>
       </w:r>
     </w:p>
     <w:p>
@@ -2009,7 +1983,7 @@
         <w:pStyle w:val="ListBullet"/>
       </w:pPr>
       <w:r>
-        <w:t>“素材组”是保存筛选条件的菜单，同时提供创建、编辑和删除；选择素材组后，同一网格展示其动态命中结果，素材组仍可直接拖拽。</w:t>
+        <w:t>“素材组”是手动维护的素材集合，同时提供创建、编辑和删除；选择素材组后，同一网格展示集合成员，素材组仍可直接拖拽。</w:t>
       </w:r>
     </w:p>
     <w:p>
@@ -2032,6 +2006,58 @@
       <w:pPr>
         <w:spacing w:after="0"/>
       </w:pPr>
+    </w:p>
+    <w:p>
+      <w:pPr>
+        <w:pStyle w:val="Heading2"/>
+      </w:pPr>
+      <w:r>
+        <w:t>4.1 工作区并行打开 2026-10-13</w:t>
+      </w:r>
+    </w:p>
+    <w:p>
+      <w:pPr>
+        <w:pStyle w:val="ListBullet"/>
+      </w:pPr>
+      <w:r>
+        <w:rPr>
+          <w:rFonts w:ascii="Calibri" w:hAnsi="Calibri" w:eastAsia="Microsoft YaHei"/>
+        </w:rPr>
+        <w:t>素材库可与小说、剧本、角色与场景、场次与镜头、任务日志等项目资料同时打开。打开素材库时保留当前资料面板及其编辑上下文；再次点击素材库只激活已有面板。</w:t>
+      </w:r>
+    </w:p>
+    <w:p>
+      <w:pPr>
+        <w:pStyle w:val="ListBullet"/>
+      </w:pPr>
+      <w:r>
+        <w:rPr>
+          <w:rFonts w:ascii="Calibri" w:hAnsi="Calibri" w:eastAsia="Microsoft YaHei"/>
+        </w:rPr>
+        <w:t>素材库使用统一工作区面板交互，支持并排停靠、拖拽排序、浮动、关闭和通过一级菜单重新打开。</w:t>
+      </w:r>
+    </w:p>
+    <w:p>
+      <w:pPr>
+        <w:pStyle w:val="ListBullet"/>
+      </w:pPr>
+      <w:r>
+        <w:rPr>
+          <w:rFonts w:ascii="Calibri" w:hAnsi="Calibri" w:eastAsia="Microsoft YaHei"/>
+        </w:rPr>
+        <w:t>面板布局按项目保存在本地，并兼容不含素材库面板的旧布局记录。切换项目时恢复目标项目布局，并重置素材库的搜索、筛选、选中素材和详情等界面状态，避免沿用前一项目的数据。</w:t>
+      </w:r>
+    </w:p>
+    <w:p>
+      <w:pPr>
+        <w:pStyle w:val="ListBullet"/>
+      </w:pPr>
+      <w:r>
+        <w:rPr>
+          <w:rFonts w:ascii="Calibri" w:hAnsi="Calibri" w:eastAsia="Microsoft YaHei"/>
+        </w:rPr>
+        <w:t>素材库正文仍为唯一素材页面，不新增内部第二层侧边栏。本地素材文件和项目数据继续由本地项目管理，GitHub 只负责源代码与评审。</w:t>
+      </w:r>
     </w:p>
     <w:p>
       <w:pPr>
@@ -2348,7 +2374,7 @@
                 <w:color w:val="252A31"/>
                 <w:sz w:val="18"/>
               </w:rPr>
-              <w:t>保存的一组标签 AND 条件</w:t>
+              <w:t>保存的一组素材引用</w:t>
             </w:r>
           </w:p>
         </w:tc>
@@ -2373,7 +2399,7 @@
                 <w:color w:val="252A31"/>
                 <w:sz w:val="18"/>
               </w:rPr>
-              <w:t>名称、标签集合、创建者、更新时间</w:t>
+              <w:t>名称、素材集合、创建者、更新时间</w:t>
             </w:r>
           </w:p>
         </w:tc>
@@ -2503,7 +2529,7 @@
                 <w:color w:val="0B2545"/>
                 <w:sz w:val="21"/>
               </w:rPr>
-              <w:t xml:space="preserve">术语边界  </w:t>
+              <w:t>术语边界 标签回答“这是什么”；素材组回答“我要复用哪一批”。素材组不是父标签，也不会修改标签层级。</w:t>
             </w:r>
             <w:r>
               <w:rPr>
@@ -2511,7 +2537,6 @@
                 <w:color w:val="0B2545"/>
                 <w:sz w:val="21"/>
               </w:rPr>
-              <w:t>标签回答“这是什么”；素材组回答“我要复用哪一批”。素材组不是父标签，也不会修改标签层级。</w:t>
             </w:r>
           </w:p>
         </w:tc>
@@ -2615,7 +2640,7 @@
         <w:rPr>
           <w:rFonts w:ascii="Calibri" w:hAnsi="Calibri" w:eastAsia="Microsoft YaHei"/>
         </w:rPr>
-        <w:t>选择素材组时，只返回同时拥有该组全部条件标签的素材。</w:t>
+        <w:t>选择素材组时，只返回该组明确保存的素材成员。</w:t>
       </w:r>
     </w:p>
     <w:p>
@@ -2627,7 +2652,7 @@
         <w:rPr>
           <w:rFonts w:ascii="Calibri" w:hAnsi="Calibri" w:eastAsia="Microsoft YaHei"/>
         </w:rPr>
-        <w:t>用户可创建由多个标签组成的素材组，之后直接打开或拖拽。</w:t>
+        <w:t>用户可通过拖放或当前多选创建素材组，之后直接打开或拖拽。</w:t>
       </w:r>
     </w:p>
     <w:p>
@@ -2639,7 +2664,7 @@
         <w:rPr>
           <w:rFonts w:ascii="Calibri" w:hAnsi="Calibri" w:eastAsia="Microsoft YaHei"/>
         </w:rPr>
-        <w:t>素材组结果随标签变化自动更新。</w:t>
+        <w:t>素材组成员只在用户添加或移除时变化。</w:t>
       </w:r>
     </w:p>
     <w:p>
@@ -3025,7 +3050,7 @@
                 <w:color w:val="252A31"/>
                 <w:sz w:val="18"/>
               </w:rPr>
-              <w:t>输入名称并选择至少一个标签；组合固定使用 AND</w:t>
+              <w:t>输入名称，将素材拖入或将当前多选素材加入集合</w:t>
             </w:r>
           </w:p>
         </w:tc>
@@ -3050,7 +3075,7 @@
                 <w:color w:val="252A31"/>
                 <w:sz w:val="18"/>
               </w:rPr>
-              <w:t>即时预览命中数量</w:t>
+              <w:t>显示当前成员数量</w:t>
             </w:r>
           </w:p>
         </w:tc>
@@ -3104,7 +3129,7 @@
                 <w:color w:val="252A31"/>
                 <w:sz w:val="18"/>
               </w:rPr>
-              <w:t>拖拽时解析当前动态结果；已删除或缺失文件的素材排除</w:t>
+              <w:t>拖拽时解析当前成员；已删除或缺失文件的素材排除</w:t>
             </w:r>
           </w:p>
         </w:tc>
@@ -3351,7 +3376,7 @@
         <w:rPr>
           <w:rFonts w:ascii="Calibri" w:hAnsi="Calibri" w:eastAsia="Microsoft YaHei"/>
         </w:rPr>
-        <w:t>标签已删除：素材解除关联；使用该标签的素材组提示条件失效并要求修复。</w:t>
+        <w:t>标签已删除：素材解除关联，不影响素材组成员关系。</w:t>
       </w:r>
     </w:p>
     <w:p>
@@ -4258,7 +4283,7 @@
                 <w:color w:val="252A31"/>
                 <w:sz w:val="18"/>
               </w:rPr>
-              <w:t>自动入库、统一浏览、别名、标签名搜索、素材组 AND 筛选、拖拽、来源定位、回收站</w:t>
+              <w:t>自动入库、统一浏览、别名、标签名搜索、手动素材组、拖拽、来源定位、回收站</w:t>
             </w:r>
           </w:p>
         </w:tc>
@@ -4504,7 +4529,7 @@
         <w:rPr>
           <w:rFonts w:ascii="Calibri" w:hAnsi="Calibri" w:eastAsia="Microsoft YaHei"/>
         </w:rPr>
-        <w:t>输入素材的物理文件名或任一标签名称时，可搜索到对应素材；顶部不出现独立标签筛选控件。选择素材组时，只返回同时拥有该组全部条件标签的素材。</w:t>
+        <w:t>输入素材的物理文件名或任一标签名称时，可搜索到对应素材；顶部不出现独立标签筛选控件。选择素材组时，只返回该组明确保存的素材成员。</w:t>
       </w:r>
     </w:p>
     <w:p>
@@ -4516,7 +4541,7 @@
         <w:rPr>
           <w:rFonts w:ascii="Calibri" w:hAnsi="Calibri" w:eastAsia="Microsoft YaHei"/>
         </w:rPr>
-        <w:t>新素材满足素材组条件后自动出现；移除任一条件标签后自动退出。</w:t>
+        <w:t>拖放或多选加入的素材会成为组成员；移除成员不会删除素材本身。</w:t>
       </w:r>
     </w:p>
     <w:p>
@@ -4577,6 +4602,42 @@
           <w:rFonts w:ascii="Calibri" w:hAnsi="Calibri" w:eastAsia="Microsoft YaHei"/>
         </w:rPr>
         <w:t>同一素材用于多个生产位置时不创建文件副本。</w:t>
+      </w:r>
+    </w:p>
+    <w:p>
+      <w:pPr>
+        <w:pStyle w:val="ListBullet"/>
+        <w:keepLines/>
+      </w:pPr>
+      <w:r>
+        <w:rPr>
+          <w:rFonts w:ascii="Calibri" w:hAnsi="Calibri" w:eastAsia="Microsoft YaHei"/>
+        </w:rPr>
+        <w:t>打开素材库后，当前小说、剧本、角色与场景、场次与镜头或任务日志仍可同时操作；素材库面板可停靠并排、拖拽排序、浮动、关闭和重新打开。</w:t>
+      </w:r>
+    </w:p>
+    <w:p>
+      <w:pPr>
+        <w:pStyle w:val="ListBullet"/>
+        <w:keepLines/>
+      </w:pPr>
+      <w:r>
+        <w:rPr>
+          <w:rFonts w:ascii="Calibri" w:hAnsi="Calibri" w:eastAsia="Microsoft YaHei"/>
+        </w:rPr>
+        <w:t>重新打开项目后恢复本地保存的面板布局；旧布局正常加载，不重复创建素材库面板。</w:t>
+      </w:r>
+    </w:p>
+    <w:p>
+      <w:pPr>
+        <w:pStyle w:val="ListBullet"/>
+        <w:keepLines/>
+      </w:pPr>
+      <w:r>
+        <w:rPr>
+          <w:rFonts w:ascii="Calibri" w:hAnsi="Calibri" w:eastAsia="Microsoft YaHei"/>
+        </w:rPr>
+        <w:t>切换项目后不保留前一项目的素材搜索、筛选、选中项和详情状态。</w:t>
       </w:r>
     </w:p>
     <w:p>
@@ -4973,7 +5034,7 @@
                 <w:color w:val="252A31"/>
                 <w:sz w:val="18"/>
               </w:rPr>
-              <w:t>具有别名或至少一个标签的素材比例</w:t>
+              <w:t>具有别名、标签或至少一个素材组归属的素材比例</w:t>
             </w:r>
           </w:p>
         </w:tc>
@@ -5134,7 +5195,7 @@
                 <w:color w:val="0B2545"/>
                 <w:sz w:val="21"/>
               </w:rPr>
-              <w:t xml:space="preserve">无待决策阻塞项  </w:t>
+              <w:t>无待决策阻塞项 本方案所需的产品规则已确认。实施中允许调整组件拆分和数据库迁移批次，但不得改变入库范围、别名语义、素材组手动成员关系、拖拽快照和回收站边界。</w:t>
             </w:r>
             <w:r>
               <w:rPr>
@@ -5142,7 +5203,6 @@
                 <w:color w:val="0B2545"/>
                 <w:sz w:val="21"/>
               </w:rPr>
-              <w:t>本方案所需的产品规则已确认。实施中允许调整组件拆分和数据库迁移批次，但不得改变入库范围、别名语义、标签 AND 规则、素材组动态更新、拖拽快照和回收站边界。</w:t>
             </w:r>
           </w:p>
         </w:tc>

</xml_diff>

<commit_message>
feat: improve composer editing and image parameter previews
</commit_message>
<xml_diff>
--- a/docs/素材库优化方案.docx
+++ b/docs/素材库优化方案.docx
@@ -111,15 +111,7 @@
               <w:spacing w:after="0"/>
             </w:pPr>
             <w:r>
-              <w:t>v1.1</w:t>
-            </w:r>
-            <w:r>
-              <w:rPr>
-                <w:rFonts w:ascii="Calibri" w:hAnsi="Calibri" w:eastAsia="Microsoft YaHei"/>
-                <w:b w:val="0"/>
-                <w:color w:val="0B2545"/>
-                <w:sz w:val="19"/>
-              </w:rPr>
+              <w:t>v1.2</w:t>
             </w:r>
           </w:p>
         </w:tc>
@@ -1585,6 +1577,60 @@
           </w:p>
         </w:tc>
       </w:tr>
+      <w:tr>
+        <w:tc>
+          <w:tcPr>
+            <w:tcW w:type="dxa" w:w="2100"/>
+            <w:shd w:fill="FAFBFC"/>
+            <w:tcMar>
+              <w:top w:w="90" w:type="dxa"/>
+              <w:start w:w="120" w:type="dxa"/>
+              <w:bottom w:w="90" w:type="dxa"/>
+              <w:end w:w="120" w:type="dxa"/>
+            </w:tcMar>
+            <w:vAlign w:val="center"/>
+          </w:tcPr>
+          <w:p>
+            <w:pPr>
+              <w:spacing w:after="0" w:line="259" w:lineRule="auto"/>
+            </w:pPr>
+            <w:r>
+              <w:rPr>
+                <w:rFonts w:ascii="Calibri" w:hAnsi="Calibri" w:eastAsia="Microsoft YaHei"/>
+                <w:color w:val="252A31"/>
+                <w:sz w:val="18"/>
+              </w:rPr>
+              <w:t>文件参数预览</w:t>
+            </w:r>
+          </w:p>
+        </w:tc>
+        <w:tc>
+          <w:tcPr>
+            <w:tcW w:type="dxa" w:w="7260"/>
+            <w:shd w:fill="FAFBFC"/>
+            <w:tcMar>
+              <w:top w:w="90" w:type="dxa"/>
+              <w:start w:w="120" w:type="dxa"/>
+              <w:bottom w:w="90" w:type="dxa"/>
+              <w:end w:w="120" w:type="dxa"/>
+            </w:tcMar>
+            <w:vAlign w:val="center"/>
+          </w:tcPr>
+          <w:p>
+            <w:pPr>
+              <w:spacing w:after="0" w:line="259" w:lineRule="auto"/>
+            </w:pPr>
+            <w:r>
+              <w:rPr>
+                <w:rFonts w:ascii="Calibri" w:hAnsi="Calibri" w:eastAsia="Microsoft YaHei"/>
+                <w:color w:val="252A31"/>
+                <w:sz w:val="18"/>
+              </w:rPr>
+              <w:t>生产区域的图片文件参数支持完整缩略预览与点击页内放大，本地上传图片与素材库引用使用一致交互。</w:t>
+            </w:r>
+          </w:p>
+        </w:tc>
+      </w:tr>
     </w:tbl>
     <w:p>
       <w:pPr>
@@ -2057,6 +2103,58 @@
           <w:rFonts w:ascii="Calibri" w:hAnsi="Calibri" w:eastAsia="Microsoft YaHei"/>
         </w:rPr>
         <w:t>素材库正文仍为唯一素材页面，不新增内部第二层侧边栏。本地素材文件和项目数据继续由本地项目管理，GitHub 只负责源代码与评审。</w:t>
+      </w:r>
+    </w:p>
+    <w:p>
+      <w:pPr>
+        <w:pStyle w:val="Heading2"/>
+      </w:pPr>
+      <w:r>
+        <w:t>4.2 文件参数预览 2026-10-15</w:t>
+      </w:r>
+    </w:p>
+    <w:p>
+      <w:pPr>
+        <w:pStyle w:val="ListBullet"/>
+      </w:pPr>
+      <w:r>
+        <w:rPr>
+          <w:rFonts w:ascii="Calibri" w:hAnsi="Calibri" w:eastAsia="Microsoft YaHei"/>
+        </w:rPr>
+        <w:t>生产区域的图片文件参数中，本地上传图片和从素材库拖入的图片均直接显示完整缩略预览，不裁切画面；保留文件名、文件大小等现有输入信息。</w:t>
+      </w:r>
+    </w:p>
+    <w:p>
+      <w:pPr>
+        <w:pStyle w:val="ListBullet"/>
+      </w:pPr>
+      <w:r>
+        <w:rPr>
+          <w:rFonts w:ascii="Calibri" w:hAnsi="Calibri" w:eastAsia="Microsoft YaHei"/>
+        </w:rPr>
+        <w:t>点击参数中的图片，在当前页面放大查看；复用现有图片查看器，可通过关闭按钮、点击遮罩或 Esc 返回。</w:t>
+      </w:r>
+    </w:p>
+    <w:p>
+      <w:pPr>
+        <w:pStyle w:val="ListBullet"/>
+      </w:pPr>
+      <w:r>
+        <w:rPr>
+          <w:rFonts w:ascii="Calibri" w:hAnsi="Calibri" w:eastAsia="Microsoft YaHei"/>
+        </w:rPr>
+        <w:t>多张图片逐项预览，排序或替换后预览对应当前文件，移除或清空后不保留旧图；查看图片不修改参数值及用户顺序。</w:t>
+      </w:r>
+    </w:p>
+    <w:p>
+      <w:pPr>
+        <w:pStyle w:val="ListBullet"/>
+      </w:pPr>
+      <w:r>
+        <w:rPr>
+          <w:rFonts w:ascii="Calibri" w:hAnsi="Calibri" w:eastAsia="Microsoft YaHei"/>
+        </w:rPr>
+        <w:t>预览沿用本地文件与素材引用，不改变自动入库范围、拖拽快照或本地优先的数据管理边界。</w:t>
       </w:r>
     </w:p>
     <w:p>
@@ -4642,6 +4740,17 @@
     </w:p>
     <w:p>
       <w:pPr>
+        <w:pStyle w:val="ListBullet"/>
+      </w:pPr>
+      <w:r>
+        <w:rPr>
+          <w:rFonts w:ascii="Calibri" w:hAnsi="Calibri" w:eastAsia="Microsoft YaHei"/>
+        </w:rPr>
+        <w:t>图片文件参数中，本地上传图片和素材库引用均完整显示缩略图，点击可页内放大；排序、替换、移除与清空后仍对应当前输入，文件信息保留。</w:t>
+      </w:r>
+    </w:p>
+    <w:p>
+      <w:pPr>
         <w:pStyle w:val="Heading1"/>
       </w:pPr>
       <w:r>

</xml_diff>

<commit_message>
feat: complete video continuity and concurrent project workflows
Add manual frame selection, confirmed first-frame continuity, and visual LLM prompt preparation. Align production inputs with model schemas and preserve source validation. Include the current workspace updates for project concurrency, retrieval, task tracking, reference cards, and synchronized implementation documents.
</commit_message>
<xml_diff>
--- a/docs/素材库优化方案.docx
+++ b/docs/素材库优化方案.docx
@@ -2155,6 +2155,70 @@
           <w:rFonts w:ascii="Calibri" w:hAnsi="Calibri" w:eastAsia="Microsoft YaHei"/>
         </w:rPr>
         <w:t>预览沿用本地文件与素材引用，不改变自动入库范围、拖拽快照或本地优先的数据管理边界。</w:t>
+      </w:r>
+    </w:p>
+    <w:p>
+      <w:pPr>
+        <w:pStyle w:val="Heading2"/>
+      </w:pPr>
+      <w:r>
+        <w:t>4.3 场次目录与统一参考资料 2026-10-17</w:t>
+      </w:r>
+    </w:p>
+    <w:p>
+      <w:pPr/>
+      <w:r>
+        <w:t>场次与镜头使用同一棵目录，每个场次下直接列出所属镜头，支持展开与收起。选择场次显示场次编辑内容，选择镜头显示镜头编辑内容。</w:t>
+      </w:r>
+    </w:p>
+    <w:p>
+      <w:pPr/>
+      <w:r>
+        <w:t>场次是故事结构，场景是可复用的地点资料。场景关联放在右侧参考资料卡片中，目录只负责导航。</w:t>
+      </w:r>
+    </w:p>
+    <w:p>
+      <w:pPr/>
+      <w:r>
+        <w:t>角色、场景、首帧及其他已有参考素材统一使用预览区域、拖入选择和底部选择控件组成的卡片。角色可关联多个，每个角色有自己的图片与声音选择；完整对白功能保留。</w:t>
+      </w:r>
+    </w:p>
+    <w:p>
+      <w:pPr/>
+      <w:r>
+        <w:t>镜头沿用所属场次已确认的角色与场景关联，直接显示实际参考图。角色图片或声音修改保存到所属场次；镜头参考图覆盖继续按镜头保存，生成时解析全部角色参考图，并保留首帧。默认继承不写成镜头覆盖。</w:t>
+      </w:r>
+    </w:p>
+    <w:p>
+      <w:pPr/>
+      <w:r>
+        <w:t>从素材库拖入卡片时校验当前项目、单张图片、有效状态与文件可读性；切换目标后丢弃旧的异步结果。图片完整显示并支持页内放大。普通提示词中的姓名或地点不直接建立关联，本地优先、静态引用快照与原有素材库规则保持有效。</w:t>
+      </w:r>
+    </w:p>
+    <w:p>
+      <w:pPr>
+        <w:pStyle w:val="Heading2"/>
+      </w:pPr>
+      <w:r>
+        <w:t>4.4 镜头衔接抽帧 2026-10-18</w:t>
+      </w:r>
+    </w:p>
+    <w:p>
+      <w:pPr/>
+      <w:r>
+        <w:t>人工选择上一镜头已成功保存的视频、画面时间点及一张衔接基准。预览候选帧只作为临时缓存，不进入素材库；人工确认后，本地抽帧成功落盘的原尺寸图片作为独立首帧素材入库，记录来源视频、内容哈希、时间点和本地任务，不修改原视频。</w:t>
+      </w:r>
+    </w:p>
+    <w:p>
+      <w:pPr/>
+      <w:r>
+        <w:t>确认后才由支持看图的 LLM 根据已选画面、下一镜头内容和人工连续性要求生成可编辑提示词。同机位直接使用基准帧；换机位复用参考生图流程，人工确认新构图后再作为下一视频首帧。多张选帧不自动成为全部模型的必填输入。</w:t>
+      </w:r>
+    </w:p>
+    <w:p>
+      <w:pPr/>
+      <w:r>
+        <w:t>衔接关系和首帧保存在当前项目 SQLite，带版本检查；源视频或图片被删除、剧情或镜头顺序变化时提示重新确认。被衔接引用的素材进入回收站前提示引用，解除衔接前不能彻底删除。项目文件仍本地保存，生成媒体沿用现有模型选择和费用确认。</w:t>
       </w:r>
     </w:p>
     <w:p>
@@ -5322,6 +5386,38 @@
         <w:spacing w:after="0"/>
       </w:pPr>
     </w:p>
+    <w:p>
+      <w:pPr>
+        <w:pStyle w:val="Heading1"/>
+        <w:keepNext/>
+      </w:pPr>
+      <w:r>
+        <w:rPr>
+          <w:color w:val="000000"/>
+        </w:rPr>
+        <w:t>并发任务实现更新</w:t>
+      </w:r>
+    </w:p>
+    <w:p>
+      <w:r>
+        <w:t>2026-10-17。统一并发计划已接入多项目运行上下文和按任务观察。激活另一项目或切换会话只改变界面订阅；显式卸载项目会停止该项目本地运行。任务和索引继续存储在本地项目 SQLite，GitHub 只管理源码和评审。</w:t>
+      </w:r>
+    </w:p>
+    <w:p>
+      <w:r>
+        <w:t>图片、视频、配音、章节和文件任务拥有独立身份，并按依赖、目标锁、版本 CAS 和共享容量执行。人工确认按项目、任务和令牌排队；取消一项任务不否决其他任务。素材库仍仅展示成功且已落盘的图片或视频，失败和排队过程留在任务日志。</w:t>
+      </w:r>
+    </w:p>
+    <w:p>
+      <w:r>
+        <w:t>普通发送采用有序跟进，独立任务可显式并行，补充输入须指定目标任务并在轮次边界消费。历史和检索遵守已冻结的任务边界；正文按需读取，草稿、正式版本与未知提交状态明确区分。审核、发布、费用确认、声音版本、采用 take 和引用快照的原有规则保持有效。</w:t>
+      </w:r>
+    </w:p>
+    <w:p>
+      <w:r>
+        <w:t>阶段验证与尚待执行的发布验收以 docs/UNIFIED-TASK-CONCURRENCY-IMPLEMENTATION-PLAN.md 及 docs/code-traces/2026-10-17-concurrency-p3.md 至 concurrency-p5d.md 为准。模拟 Provider 测试不替代真实账号质量、Windows 休眠、旧版本升级或签名验收。</w:t>
+      </w:r>
+    </w:p>
     <w:sectPr>
       <w:headerReference w:type="default" r:id="rId9"/>
       <w:footerReference w:type="default" r:id="rId10"/>

</xml_diff>

<commit_message>
feat: preserve local media preview and asset card improvements
</commit_message>
<xml_diff>
--- a/docs/素材库优化方案.docx
+++ b/docs/素材库优化方案.docx
@@ -1146,7 +1146,7 @@
                 <w:color w:val="252A31"/>
                 <w:sz w:val="18"/>
               </w:rPr>
-              <w:t>仅提供别名，不增加备注字段；未设置时显示可读的默认名称。</w:t>
+              <w:t>仅提供别名，不增加备注字段；预览卡片仅显示已设置的别名，不回退显示物理文件名。</w:t>
             </w:r>
           </w:p>
         </w:tc>
@@ -2155,6 +2155,134 @@
           <w:rFonts w:ascii="Calibri" w:hAnsi="Calibri" w:eastAsia="Microsoft YaHei"/>
         </w:rPr>
         <w:t>预览沿用本地文件与素材引用，不改变自动入库范围、拖拽快照或本地优先的数据管理边界。</w:t>
+      </w:r>
+    </w:p>
+    <w:p>
+      <w:pPr>
+        <w:pStyle w:val="Heading2"/>
+      </w:pPr>
+      <w:r>
+        <w:t>4.3 素材预览卡片样式 2026-10-16</w:t>
+      </w:r>
+    </w:p>
+    <w:p>
+      <w:pPr>
+        <w:pStyle w:val="ListBullet"/>
+      </w:pPr>
+      <w:r>
+        <w:rPr>
+          <w:rFonts w:ascii="Calibri" w:hAnsi="Calibri" w:eastAsia="Microsoft YaHei"/>
+        </w:rPr>
+        <w:t>素材网格采用更大的方形预览区，图片与视频保持完整画面显示，不裁切主体。</w:t>
+      </w:r>
+    </w:p>
+    <w:p>
+      <w:pPr>
+        <w:pStyle w:val="ListBullet"/>
+      </w:pPr>
+      <w:r>
+        <w:rPr>
+          <w:rFonts w:ascii="Calibri" w:hAnsi="Calibri" w:eastAsia="Microsoft YaHei"/>
+        </w:rPr>
+        <w:t>卡片不显示物理文件名；仅在用户设置了别名时显示一行别名，过长省略并可悬停查看完整别名。没有别名或标签时不创建对应的信息行。</w:t>
+      </w:r>
+    </w:p>
+    <w:p>
+      <w:pPr>
+        <w:pStyle w:val="ListBullet"/>
+      </w:pPr>
+      <w:r>
+        <w:rPr>
+          <w:rFonts w:ascii="Calibri" w:hAnsi="Calibri" w:eastAsia="Microsoft YaHei"/>
+        </w:rPr>
+        <w:t>底部保留创建日期与文件大小，已添加的标签继续展示；选中、键盘选择、多选和拖拽沿用原有交互。</w:t>
+      </w:r>
+    </w:p>
+    <w:p>
+      <w:pPr>
+        <w:pStyle w:val="ListBullet"/>
+      </w:pPr>
+      <w:r>
+        <w:rPr>
+          <w:rFonts w:ascii="Calibri" w:hAnsi="Calibri" w:eastAsia="Microsoft YaHei"/>
+        </w:rPr>
+        <w:t>文件名仍可用于搜索，并在详情文件路径中查看；磁盘文件名、素材引用和本地存储规则不变。</w:t>
+      </w:r>
+    </w:p>
+    <w:p>
+      <w:pPr>
+        <w:pStyle w:val="Heading2"/>
+      </w:pPr>
+      <w:r>
+        <w:t>4.4 场次角色媒体预览 2026-10-16</w:t>
+      </w:r>
+    </w:p>
+    <w:p>
+      <w:pPr>
+        <w:spacing w:after="80"/>
+        <w:pBdr>
+          <w:left w:val="single" w:sz="18" w:space="7" w:color="2E74B5"/>
+        </w:pBdr>
+      </w:pPr>
+      <w:r>
+        <w:rPr>
+          <w:rFonts w:ascii="Calibri" w:hAnsi="Calibri" w:eastAsia="Microsoft YaHei"/>
+          <w:b/>
+          <w:color w:val="2E74B5"/>
+          <w:sz w:val="18"/>
+        </w:rPr>
+        <w:t>场次已绑定角色后，即使图片或声音样本稍后才准备好，也能预览角色默认资源；默认图片为该角色最早生成且仍有效的图片，新增图片不自动替换它，场次可指定其他图片或固定声音版本。</w:t>
+      </w:r>
+    </w:p>
+    <w:p>
+      <w:pPr>
+        <w:spacing w:after="80"/>
+        <w:pBdr>
+          <w:left w:val="single" w:sz="18" w:space="7" w:color="2E74B5"/>
+        </w:pBdr>
+      </w:pPr>
+      <w:r>
+        <w:rPr>
+          <w:rFonts w:ascii="Calibri" w:hAnsi="Calibri" w:eastAsia="Microsoft YaHei"/>
+          <w:b/>
+          <w:color w:val="2E74B5"/>
+          <w:sz w:val="18"/>
+        </w:rPr>
+        <w:t>“使用角色默认”“本场指定”“不使用”分别处理；明确不使用后，后续资源更新不自动补回。已有明确选择保持原引用，历史声音版本的文件有效时仍能试听，更新提示不替换原选择。</w:t>
+      </w:r>
+    </w:p>
+    <w:p>
+      <w:pPr>
+        <w:spacing w:after="80"/>
+        <w:pBdr>
+          <w:left w:val="single" w:sz="18" w:space="7" w:color="2E74B5"/>
+        </w:pBdr>
+      </w:pPr>
+      <w:r>
+        <w:rPr>
+          <w:rFonts w:ascii="Calibri" w:hAnsi="Calibri" w:eastAsia="Microsoft YaHei"/>
+          <w:b/>
+          <w:color w:val="2E74B5"/>
+          <w:sz w:val="18"/>
+        </w:rPr>
+        <w:t>已选媒体按 ID 读取，不受素材库分页影响；只查询当前场次角色及其相关媒体，通过生成完成和声音变更事件刷新，不轮询或批量改写其他场次。</w:t>
+      </w:r>
+    </w:p>
+    <w:p>
+      <w:pPr>
+        <w:spacing w:after="80"/>
+        <w:pBdr>
+          <w:left w:val="single" w:sz="18" w:space="7" w:color="2E74B5"/>
+        </w:pBdr>
+      </w:pPr>
+      <w:r>
+        <w:rPr>
+          <w:rFonts w:ascii="Calibri" w:hAnsi="Calibri" w:eastAsia="Microsoft YaHei"/>
+          <w:b/>
+          <w:color w:val="2E74B5"/>
+          <w:sz w:val="18"/>
+        </w:rPr>
+        <w:t>图片在可见时加载按内容哈希复用的真实缩略图，点击放大才读取原图；声音点击试听后才读取，播放器使用 preload=none。生成提交继续冻结实际输入，媒体文件保持项目本地单份引用，声音样本继续使用独立音频库。</w:t>
       </w:r>
     </w:p>
     <w:p>

</xml_diff>

<commit_message>
fix: repair Agent pipeline, library budgets and desktop interactions
</commit_message>
<xml_diff>
--- a/docs/素材库优化方案.docx
+++ b/docs/素材库优化方案.docx
@@ -2045,7 +2045,7 @@
         <w:pStyle w:val="ListBullet"/>
       </w:pPr>
       <w:r>
-        <w:t>生成图片直接显示预览；角色/场景图片、镜头图片及参考图、生成结果和素材详情中的预览均完整显示画面。点击图片在当前页面放大查看，可通过关闭按钮、点击遮罩或 Esc 返回；一次生成多张图片时逐张预览。</w:t>
+        <w:t>生成图片在角色/场景、镜头及素材库中直接显示预览，完整显示画面；生产参数面板不再显示单独的生成结果区域。点击图片在当前页面放大查看，可通过关闭按钮、点击遮罩或 Esc 返回；一次生成多张图片时逐张预览。</w:t>
       </w:r>
     </w:p>
     <w:p>
@@ -2347,6 +2347,47 @@
           <w:sz w:val="18"/>
         </w:rPr>
         <w:t>图片在可见时加载按内容哈希复用的真实缩略图，点击放大才读取原图；声音点击试听后才读取，播放器使用 preload=none。生成提交继续冻结实际输入，媒体文件保持项目本地单份引用，声音样本继续使用独立音频库。</w:t>
+      </w:r>
+    </w:p>
+    <w:p>
+      <w:pPr>
+        <w:pStyle w:val="Heading2"/>
+      </w:pPr>
+      <w:r>
+        <w:t>4.7 生产参数面板收敛 2026-10-19</w:t>
+      </w:r>
+    </w:p>
+    <w:p>
+      <w:pPr>
+        <w:pStyle w:val="ListBullet"/>
+      </w:pPr>
+      <w:r>
+        <w:rPr>
+          <w:rFonts w:ascii="Calibri" w:hAnsi="Calibri" w:eastAsia="Microsoft YaHei"/>
+        </w:rPr>
+        <w:t>生产参数面板移除右侧“生成结果”区域，包括自动预览、空状态及重复的素材列表，参数表单使用面板全部宽度。</w:t>
+      </w:r>
+    </w:p>
+    <w:p>
+      <w:pPr>
+        <w:pStyle w:val="ListBullet"/>
+      </w:pPr>
+      <w:r>
+        <w:rPr>
+          <w:rFonts w:ascii="Calibri" w:hAnsi="Calibri" w:eastAsia="Microsoft YaHei"/>
+        </w:rPr>
+        <w:t>成功生成的图片和视频继续自动保存到本地素材库，角色/场景及镜头工作区继续显示所属生成图片；图片文件参数的输入预览保留。</w:t>
+      </w:r>
+    </w:p>
+    <w:p>
+      <w:pPr>
+        <w:pStyle w:val="ListBullet"/>
+      </w:pPr>
+      <w:r>
+        <w:rPr>
+          <w:rFonts w:ascii="Calibri" w:hAnsi="Calibri" w:eastAsia="Microsoft YaHei"/>
+        </w:rPr>
+        <w:t>视频任务的“查看素材”打开素材库并定位对应素材，系统播放器与打开位置入口保留。</w:t>
       </w:r>
     </w:p>
     <w:p>

</xml_diff>

<commit_message>
refactor: focus production forms on prompts and reference media
Unify flat and structured media previews, simplify secondary settings, and add production pane collapse controls. Preserve media references and surface validation errors. Update regression coverage and synchronized asset plans.
</commit_message>
<xml_diff>
--- a/docs/素材库优化方案.docx
+++ b/docs/素材库优化方案.docx
@@ -2118,10 +2118,7 @@
         <w:pStyle w:val="ListBullet"/>
       </w:pPr>
       <w:r>
-        <w:rPr>
-          <w:rFonts w:ascii="Calibri" w:hAnsi="Calibri" w:eastAsia="Microsoft YaHei"/>
-        </w:rPr>
-        <w:t>生产区域的图片文件参数中，本地上传图片和从素材库拖入的图片均直接显示完整缩略预览，不裁切画面；保留文件名、文件大小等现有输入信息。</w:t>
+        <w:t>生产区域的图片文件参数中，本地上传图片、素材库拖入图片和自动填入的项目图片均只显示 112 px 的完整缩略预览，不裁切画面；不显示资源地址、文件名或文件大小。图片卡片横向排列并按面板宽度换行，替换、排序和清除操作位于图片下方，添加图片入口位于字段标题旁。空输入仍可填写公开 URL。</w:t>
       </w:r>
     </w:p>
     <w:p>
@@ -2388,6 +2385,14 @@
           <w:rFonts w:ascii="Calibri" w:hAnsi="Calibri" w:eastAsia="Microsoft YaHei"/>
         </w:rPr>
         <w:t>视频任务的“查看素材”打开素材库并定位对应素材，系统播放器与打开位置入口保留。</w:t>
+      </w:r>
+    </w:p>
+    <w:p>
+      <w:pPr>
+        <w:pStyle w:val="ListBullet"/>
+      </w:pPr>
+      <w:r>
+        <w:t>制作页默认突出提示词与参考素材，模型选择后直接进入内容编辑；不展示模型详情。正常制作说明默认折叠，输出参数、专业参数和项目默认值集中在“更多设置”；阻塞制作或参数校验错误时自动展开相关区域。图片卡片仅在编辑地址时显示填写说明，没有视频任务或可选声音样本时不展示对应空区域。</w:t>
       </w:r>
     </w:p>
     <w:p>
@@ -4976,10 +4981,7 @@
         <w:pStyle w:val="ListBullet"/>
       </w:pPr>
       <w:r>
-        <w:rPr>
-          <w:rFonts w:ascii="Calibri" w:hAnsi="Calibri" w:eastAsia="Microsoft YaHei"/>
-        </w:rPr>
-        <w:t>图片文件参数中，本地上传图片和素材库引用均完整显示缩略图，点击可页内放大；排序、替换、移除与清空后仍对应当前输入，文件信息保留。</w:t>
+        <w:t>图片文件参数中，本地上传图片和素材库引用均只显示小缩略图，点击可页内放大；不显示资源地址或文件信息，排序、替换、移除与清空后仍对应当前输入。</w:t>
       </w:r>
     </w:p>
     <w:p>

</xml_diff>

<commit_message>
refactor: prioritize workspace prompts and bindings
Show scene binding links and shared reference controls, simplify secondary panels, and enable prompt height resizing. Make scene titles and expandable menus toggle consistently while preserving form values. Update regression coverage and synchronized asset plans.
</commit_message>
<xml_diff>
--- a/docs/素材库优化方案.docx
+++ b/docs/素材库优化方案.docx
@@ -2165,7 +2165,7 @@
     <w:p>
       <w:pPr/>
       <w:r>
-        <w:t>场次与镜头使用同一棵目录，每个场次下直接列出所属镜头，支持展开与收起。选择场次显示场次编辑内容，选择镜头显示镜头编辑内容。</w:t>
+        <w:t>场次与镜头使用同一棵目录，每个场次下直接列出所属镜头，场次标题与箭头均支持点击展开、再次点击收起；切换正文不会强制重开刚收起的目录。选择场次显示场次编辑内容，选择镜头显示镜头编辑内容。其他页面的同类展开入口使用相同的再次点击收起交互，收起不清空已填内容或触发提交。</w:t>
       </w:r>
     </w:p>
     <w:p>
@@ -2190,6 +2190,12 @@
       <w:pPr/>
       <w:r>
         <w:t>从素材库拖入卡片时校验当前项目、单张图片、有效状态与文件可读性；切换目标后丢弃旧的异步结果。图片完整显示并支持页内放大。普通提示词中的姓名或地点不直接建立关联，本地优先、静态引用快照与原有素材库规则保持有效。</w:t>
+      </w:r>
+    </w:p>
+    <w:p>
+      <w:pPr/>
+      <w:r>
+        <w:t>角色与场景、场次与镜头页面优先展示提示词和绑定关系。四类提示词编辑框最低高度统一为 320 px，支持拖动右下角纵向调高，不能缩小到最低高度以下。角色/场景页按文档 ID 展示已绑定场次数量和跳转入口，声音设置与历史版本默认折叠；场次/镜头页在提示词后统一展示角色、场景与参考图，明确场次共享范围，助手关联和保存绑定集中在绑定区。衔接、分镜笔记、完整对白和配音作为次要操作展开使用；已绑定对白和失效衔接的状态仍明确显示。该调整只使用现有关系，不根据提示词或同名标题推断绑定。</w:t>
       </w:r>
     </w:p>
     <w:p>

</xml_diff>

<commit_message>
feat: merge production workflow updates
</commit_message>
<xml_diff>
--- a/docs/素材库优化方案.docx
+++ b/docs/素材库优化方案.docx
@@ -2196,6 +2196,18 @@
       <w:pPr/>
       <w:r>
         <w:t>角色与场景、场次与镜头页面优先展示提示词和绑定关系。四类提示词编辑框最低高度统一为 320 px，支持拖动右下角纵向调高，不能缩小到最低高度以下。角色/场景页按文档 ID 展示已绑定场次数量和跳转入口，声音设置与历史版本默认折叠；场次/镜头页在提示词后统一展示角色、场景与参考图，明确场次共享范围，助手关联和保存绑定集中在绑定区。衔接、分镜笔记、完整对白和配音作为次要操作展开使用；已绑定对白和失效衔接的状态仍明确显示。该调整只使用现有关系，不根据提示词或同名标题推断绑定。</w:t>
+      </w:r>
+    </w:p>
+    <w:p>
+      <w:pPr/>
+      <w:r>
+        <w:t>2026-10-23 用户确认：角色、场景、道具按文档的实际类型独立归类，当前打开的文档也必须遵守目录类型筛选；切换筛选保留编辑器中未保存的内容。地点与环境属于场景，人物属于角色，独立物件属于道具；剧情不需要道具时允许道具列表为空，不为补齐类型创建占位资料。</w:t>
+      </w:r>
+    </w:p>
+    <w:p>
+      <w:pPr/>
+      <w:r>
+        <w:t>单镜角色声明覆盖整个镜头实际可见的人物，包括背景、远景、无台词及收尾短暂入画的人物。Agent 根据语义使提示词与 IR 引用保持一致，系统只校验结构、文档 ID、项目和类型，不从正文姓名推断或补齐角色。明确的空角色数组表示无人物；新镜头省略角色范围时继承场次，修订省略时保留已有范围。已经保存的漏列引用需经 Agent 或用户明确修订，不自动改写。</w:t>
       </w:r>
     </w:p>
     <w:p>
@@ -4991,6 +5003,18 @@
       </w:r>
     </w:p>
     <w:p>
+      <w:pPr/>
+      <w:r>
+        <w:t>提示词中的图片、音频、视频引用使用内联标签，图片标签包含缩略图。标签绑定当前模型参数中的真实素材，编号随提交顺序同步；替换或移除素材时旧引用不转绑其他素材。正文和模型参数保存在同一草稿快照，提交时标签转换为模型支持的提示词写法。删除正文中的标签只删除该处引用。制作面板和 Agent 审核表单共享实现，审核后直接提交。</w:t>
+      </w:r>
+    </w:p>
+    <w:p>
+      <w:pPr/>
+      <w:r>
+        <w:t>2026-10-23 Agent 按需媒体读取：制作 Agent 可通过 scene.read / production.read 的 view=media 读取同一生产解析器得到的角色、场景和道具图片绑定，区分手动、默认、禁用和未选用，返回有界候选图、素材可用性及提交前的输入顺序；asset.get 返回受限的生成来源与输入素材 ID。候选图不等于选用图，未读取图片像素时不得声称看到了外观细节；IR 的文档引用继续使用文档 ID，不把 assetId 写入创作语义。普通会话仍按需读取，不自动注入整库素材。</w:t>
+      </w:r>
+    </w:p>
+    <w:p>
       <w:pPr>
         <w:pStyle w:val="Heading1"/>
       </w:pPr>

</xml_diff>